<commit_message>
Update the change list and todo list: email now sent by the website, databases migrated, staging item removed
Co-Authored-By: Claude Sonnet 5 <noreply@anthropic.com>
</commit_message>
<xml_diff>
--- a/CHANGES-ETHAN-BRANCH.docx
+++ b/CHANGES-ETHAN-BRANCH.docx
@@ -996,7 +996,7 @@
         <w:pStyle w:val="ListBullet"/>
       </w:pPr>
       <w:r>
-        <w:t>Admin gets an email link to review the listing (as before).</w:t>
+        <w:t>Our team is emailed by the server as soon as a listing is saved, with a review link. Nothing opens the visitor's email app.</w:t>
       </w:r>
     </w:p>
     <w:p>
@@ -1261,7 +1261,7 @@
         <w:t>Contact:</w:t>
       </w:r>
       <w:r>
-        <w:t xml:space="preserve"> the mockup layout; the form opens the visitor's email app with a prefilled message; direct-line cards.</w:t>
+        <w:t xml:space="preserve"> the mockup layout; the form sends through the website (the message is saved and emailed to us by the server); the contact address is shown as text, not a mail link.</w:t>
       </w:r>
     </w:p>
     <w:p>
@@ -1272,10 +1272,21 @@
         <w:rPr>
           <w:b/>
         </w:rPr>
-        <w:t>Privacy &amp; POPIA and Terms:</w:t>
-      </w:r>
-      <w:r>
-        <w:t xml:space="preserve"> one shared layout with four tabs (Privacy, Terms, Listing rules, Cookies). Existing real clauses (copyright, data removal, data sources, AdSense wording) were merged in so none were lost. The mockup's own placeholder wording needs a lawyer's review before launch.</w:t>
+        <w:t>Email handling:</w:t>
+      </w:r>
+      <w:r>
+        <w:t xml:space="preserve"> every form on the sites (contact, listing enquiry, report, data removal, add event, add business) posts to the website's own endpoints, which save the message and email it server-side. No </w:t>
+      </w:r>
+      <w:r>
+        <w:rPr>
+          <w:rFonts w:ascii="Consolas" w:hAnsi="Consolas"/>
+          <w:color w:val="1F4E8C"/>
+          <w:sz w:val="19"/>
+        </w:rPr>
+        <w:t>mailto:</w:t>
+      </w:r>
+      <w:r>
+        <w:t xml:space="preserve"> links exist anywhere.</w:t>
       </w:r>
     </w:p>
     <w:p>
@@ -1286,6 +1297,20 @@
         <w:rPr>
           <w:b/>
         </w:rPr>
+        <w:t>Privacy &amp; POPIA and Terms:</w:t>
+      </w:r>
+      <w:r>
+        <w:t xml:space="preserve"> one shared layout with four tabs (Privacy, Terms, Listing rules, Cookies). Existing real clauses (copyright, data removal, data sources, AdSense wording) were merged in so none were lost. The mockup's own placeholder wording needs a lawyer's review before launch.</w:t>
+      </w:r>
+    </w:p>
+    <w:p>
+      <w:pPr>
+        <w:pStyle w:val="ListBullet"/>
+      </w:pPr>
+      <w:r>
+        <w:rPr>
+          <w:b/>
+        </w:rPr>
         <w:t>404 page:</w:t>
       </w:r>
       <w:r>
@@ -1327,7 +1352,7 @@
         <w:pStyle w:val="ListBullet"/>
       </w:pPr>
       <w:r>
-        <w:t>Enquiries and Analytics are honest empty states because nothing stores that data yet.</w:t>
+        <w:t>The Enquiries tab lists the messages stored from the contact page and each listing's enquiry form (Close, Reopen, Delete). Analytics is still an honest empty state because nothing records views or clicks yet.</w:t>
       </w:r>
     </w:p>
     <w:p>
@@ -2113,7 +2138,7 @@
               <w:rPr>
                 <w:sz w:val="19"/>
               </w:rPr>
-              <w:t>Applied on Cape Town only</w:t>
+              <w:t>Applied on all three</w:t>
             </w:r>
           </w:p>
         </w:tc>
@@ -2199,7 +2224,93 @@
               <w:rPr>
                 <w:sz w:val="19"/>
               </w:rPr>
-              <w:t>Applied on Cape Town only</w:t>
+              <w:t>Applied on all three</w:t>
+            </w:r>
+          </w:p>
+        </w:tc>
+      </w:tr>
+      <w:tr>
+        <w:tc>
+          <w:tcPr>
+            <w:tcW w:type="dxa" w:w="1662"/>
+          </w:tcPr>
+          <w:p>
+            <w:r/>
+            <w:r>
+              <w:rPr>
+                <w:sz w:val="19"/>
+              </w:rPr>
+              <w:t>Messages</w:t>
+            </w:r>
+          </w:p>
+        </w:tc>
+        <w:tc>
+          <w:tcPr>
+            <w:tcW w:type="dxa" w:w="1662"/>
+          </w:tcPr>
+          <w:p>
+            <w:r/>
+            <w:r>
+              <w:rPr>
+                <w:sz w:val="19"/>
+              </w:rPr>
+              <w:t>0038</w:t>
+            </w:r>
+          </w:p>
+        </w:tc>
+        <w:tc>
+          <w:tcPr>
+            <w:tcW w:type="dxa" w:w="1662"/>
+          </w:tcPr>
+          <w:p>
+            <w:r/>
+            <w:r>
+              <w:rPr>
+                <w:sz w:val="19"/>
+              </w:rPr>
+              <w:t>0037</w:t>
+            </w:r>
+          </w:p>
+        </w:tc>
+        <w:tc>
+          <w:tcPr>
+            <w:tcW w:type="dxa" w:w="1662"/>
+          </w:tcPr>
+          <w:p>
+            <w:r/>
+            <w:r>
+              <w:rPr>
+                <w:sz w:val="19"/>
+              </w:rPr>
+              <w:t>0040</w:t>
+            </w:r>
+          </w:p>
+        </w:tc>
+        <w:tc>
+          <w:tcPr>
+            <w:tcW w:type="dxa" w:w="1662"/>
+          </w:tcPr>
+          <w:p>
+            <w:r/>
+            <w:r>
+              <w:rPr>
+                <w:sz w:val="19"/>
+              </w:rPr>
+              <w:t>contact messages and listing enquiries</w:t>
+            </w:r>
+          </w:p>
+        </w:tc>
+        <w:tc>
+          <w:tcPr>
+            <w:tcW w:type="dxa" w:w="1662"/>
+          </w:tcPr>
+          <w:p>
+            <w:r/>
+            <w:r>
+              <w:rPr>
+                <w:sz w:val="19"/>
+              </w:rPr>
+              <w:t>Applied on all three</w:t>
             </w:r>
           </w:p>
         </w:tc>
@@ -2301,7 +2412,7 @@
     </w:p>
     <w:p>
       <w:r>
-        <w:t>Pending: run the event submissions and news migrations on Pretoria and Polokwane, and keep both sets of events migration files when merging so the recorded names still match.</w:t>
+        <w:t>All of the above are applied on all three production databases (20 September 2026, after a backup). When merging, keep both sets of events migration files so the recorded names still match.</w:t>
       </w:r>
     </w:p>
     <w:p>
@@ -2324,6 +2435,39 @@
       </w:r>
       <w:r>
         <w:t xml:space="preserve"> </w:t>
+      </w:r>
+      <w:r>
+        <w:rPr>
+          <w:rFonts w:ascii="Consolas" w:hAnsi="Consolas"/>
+          <w:color w:val="1F4E8C"/>
+          <w:sz w:val="19"/>
+        </w:rPr>
+        <w:t>contact</w:t>
+      </w:r>
+      <w:r>
+        <w:t xml:space="preserve">, </w:t>
+      </w:r>
+      <w:r>
+        <w:rPr>
+          <w:rFonts w:ascii="Consolas" w:hAnsi="Consolas"/>
+          <w:color w:val="1F4E8C"/>
+          <w:sz w:val="19"/>
+        </w:rPr>
+        <w:t>enquiry</w:t>
+      </w:r>
+      <w:r>
+        <w:t xml:space="preserve">, </w:t>
+      </w:r>
+      <w:r>
+        <w:rPr>
+          <w:rFonts w:ascii="Consolas" w:hAnsi="Consolas"/>
+          <w:color w:val="1F4E8C"/>
+          <w:sz w:val="19"/>
+        </w:rPr>
+        <w:t>admin/messages</w:t>
+      </w:r>
+      <w:r>
+        <w:t xml:space="preserve">, </w:t>
       </w:r>
       <w:r>
         <w:rPr>
@@ -2581,7 +2725,7 @@
         <w:pStyle w:val="ListBullet"/>
       </w:pPr>
       <w:r>
-        <w:t>No reviews or star ratings; no page-view, click or enquiry data (tiles show "No data yet").</w:t>
+        <w:t>No reviews or star ratings, and no page-view or click data (tiles show "No data yet"). A business owner's own dashboard does not yet list the enquiries sent to it.</w:t>
       </w:r>
     </w:p>
     <w:p>
@@ -2708,14 +2852,6 @@
         <w:pStyle w:val="ListBullet"/>
       </w:pPr>
       <w:r>
-        <w:t>"Report this listing" and "Request data removal" pages email through the visitor's mail app, so the admin Reports tab never receives them.</w:t>
-      </w:r>
-    </w:p>
-    <w:p>
-      <w:pPr>
-        <w:pStyle w:val="ListBullet"/>
-      </w:pPr>
-      <w:r>
         <w:rPr>
           <w:rFonts w:ascii="Consolas" w:hAnsi="Consolas"/>
           <w:color w:val="1F4E8C"/>
@@ -2740,7 +2876,7 @@
         <w:pStyle w:val="ListBullet"/>
       </w:pPr>
       <w:r>
-        <w:t>Live databases: Cape Town received the event submissions and news migrations; 2 real events (Oranjezicht City Farm Market, First Thursdays) added to Cape Town; 4 news stories and 4 fuel prices added to Cape Town; a demo admin user row added to all three databases; test businesses created during testing were removed.</w:t>
+        <w:t>Live databases: all three received the event submissions, news/fuel and messages migrations (after a backup); 2 real events (Oranjezicht City Farm Market, First Thursdays) added to Cape Town; 4 news stories added to Cape Town and September fuel prices to all three; a demo admin user row added to all three databases; test businesses created during testing were removed.</w:t>
       </w:r>
     </w:p>
     <w:p>
@@ -4748,7 +4884,7 @@
     <w:qFormat/>
     <w:rsid w:val="00FC693F"/>
     <w:rPr>
-      <w:rFonts w:ascii="Calibri" w:hAnsi="Calibri" w:eastAsia="Calibri"/>
+      <w:rFonts w:ascii="Calibri" w:hAnsi="Calibri"/>
       <w:sz w:val="21"/>
     </w:rPr>
   </w:style>
@@ -4811,11 +4947,11 @@
       <w:outlineLvl w:val="0"/>
     </w:pPr>
     <w:rPr>
-      <w:rFonts w:asciiTheme="majorHAnsi" w:eastAsiaTheme="majorEastAsia" w:hAnsiTheme="majorHAnsi" w:cstheme="majorBidi" w:ascii="Calibri" w:hAnsi="Calibri" w:eastAsia="Calibri"/>
+      <w:rFonts w:asciiTheme="majorHAnsi" w:eastAsiaTheme="majorEastAsia" w:hAnsiTheme="majorHAnsi" w:cstheme="majorBidi" w:ascii="Calibri" w:hAnsi="Calibri"/>
       <w:b/>
       <w:bCs/>
       <w:color w:val="0A2540"/>
-      <w:sz w:val="32"/>
+      <w:sz w:val="30"/>
       <w:szCs w:val="28"/>
     </w:rPr>
   </w:style>
@@ -4835,10 +4971,10 @@
       <w:outlineLvl w:val="1"/>
     </w:pPr>
     <w:rPr>
-      <w:rFonts w:asciiTheme="majorHAnsi" w:eastAsiaTheme="majorEastAsia" w:hAnsiTheme="majorHAnsi" w:cstheme="majorBidi" w:ascii="Calibri" w:hAnsi="Calibri" w:eastAsia="Calibri"/>
+      <w:rFonts w:asciiTheme="majorHAnsi" w:eastAsiaTheme="majorEastAsia" w:hAnsiTheme="majorHAnsi" w:cstheme="majorBidi"/>
       <w:b/>
       <w:bCs/>
-      <w:color w:val="0A2540"/>
+      <w:color w:val="4F81BD" w:themeColor="accent1"/>
       <w:sz w:val="26"/>
       <w:szCs w:val="26"/>
     </w:rPr>
@@ -5100,12 +5236,12 @@
       <w:contextualSpacing/>
     </w:pPr>
     <w:rPr>
-      <w:rFonts w:asciiTheme="majorHAnsi" w:eastAsiaTheme="majorEastAsia" w:hAnsiTheme="majorHAnsi" w:cstheme="majorBidi" w:ascii="Calibri" w:hAnsi="Calibri" w:eastAsia="Calibri"/>
+      <w:rFonts w:asciiTheme="majorHAnsi" w:eastAsiaTheme="majorEastAsia" w:hAnsiTheme="majorHAnsi" w:cstheme="majorBidi" w:ascii="Calibri" w:hAnsi="Calibri"/>
       <w:b/>
       <w:color w:val="0A2540"/>
       <w:spacing w:val="5"/>
       <w:kern w:val="28"/>
-      <w:sz w:val="52"/>
+      <w:sz w:val="48"/>
       <w:szCs w:val="52"/>
     </w:rPr>
   </w:style>

</xml_diff>

<commit_message>
Record the live data loaded on 20 September (map coordinates, categories, first Pretoria and Polokwane news) and update the change and todo lists
Co-Authored-By: Claude Sonnet 5 <noreply@anthropic.com>
</commit_message>
<xml_diff>
--- a/CHANGES-ETHAN-BRANCH.docx
+++ b/CHANGES-ETHAN-BRANCH.docx
@@ -1004,7 +1004,7 @@
         <w:pStyle w:val="ListBullet"/>
       </w:pPr>
       <w:r>
-        <w:t>Trading hours and shopping centre are collected but not saved (see section 20).</w:t>
+        <w:t>Trading hours and shopping centre are saved on the pending listing and copied onto the business when it is approved.</w:t>
       </w:r>
     </w:p>
     <w:p>
@@ -1635,6 +1635,47 @@
       </w:pPr>
       <w:r>
         <w:t>17. Bug fixes and data-quality fixes</w:t>
+      </w:r>
+    </w:p>
+    <w:p>
+      <w:pPr>
+        <w:pStyle w:val="ListBullet"/>
+      </w:pPr>
+      <w:r>
+        <w:t xml:space="preserve">Public forms are rate limited per visitor per hour; </w:t>
+      </w:r>
+      <w:r>
+        <w:rPr>
+          <w:rFonts w:ascii="Consolas" w:hAnsi="Consolas"/>
+          <w:color w:val="1F4E8C"/>
+          <w:sz w:val="19"/>
+        </w:rPr>
+        <w:t>/tourism/</w:t>
+      </w:r>
+      <w:r>
+        <w:t xml:space="preserve"> redirects home on the sites without a tourism section; a backend type-check runs before each preview deploy; </w:t>
+      </w:r>
+      <w:r>
+        <w:rPr>
+          <w:rFonts w:ascii="Consolas" w:hAnsi="Consolas"/>
+          <w:color w:val="1F4E8C"/>
+          <w:sz w:val="19"/>
+        </w:rPr>
+        <w:t>npm run check:links</w:t>
+      </w:r>
+      <w:r>
+        <w:t xml:space="preserve"> and </w:t>
+      </w:r>
+      <w:r>
+        <w:rPr>
+          <w:rFonts w:ascii="Consolas" w:hAnsi="Consolas"/>
+          <w:color w:val="1F4E8C"/>
+          <w:sz w:val="19"/>
+        </w:rPr>
+        <w:t>npm run check:smoke</w:t>
+      </w:r>
+      <w:r>
+        <w:t xml:space="preserve"> verify a build.</w:t>
       </w:r>
     </w:p>
     <w:p>
@@ -2315,6 +2356,178 @@
           </w:p>
         </w:tc>
       </w:tr>
+      <w:tr>
+        <w:tc>
+          <w:tcPr>
+            <w:tcW w:type="dxa" w:w="1662"/>
+          </w:tcPr>
+          <w:p>
+            <w:r/>
+            <w:r>
+              <w:rPr>
+                <w:sz w:val="19"/>
+              </w:rPr>
+              <w:t>Submission hours and centre</w:t>
+            </w:r>
+          </w:p>
+        </w:tc>
+        <w:tc>
+          <w:tcPr>
+            <w:tcW w:type="dxa" w:w="1662"/>
+          </w:tcPr>
+          <w:p>
+            <w:r/>
+            <w:r>
+              <w:rPr>
+                <w:sz w:val="19"/>
+              </w:rPr>
+              <w:t>0039</w:t>
+            </w:r>
+          </w:p>
+        </w:tc>
+        <w:tc>
+          <w:tcPr>
+            <w:tcW w:type="dxa" w:w="1662"/>
+          </w:tcPr>
+          <w:p>
+            <w:r/>
+            <w:r>
+              <w:rPr>
+                <w:sz w:val="19"/>
+              </w:rPr>
+              <w:t>0038</w:t>
+            </w:r>
+          </w:p>
+        </w:tc>
+        <w:tc>
+          <w:tcPr>
+            <w:tcW w:type="dxa" w:w="1662"/>
+          </w:tcPr>
+          <w:p>
+            <w:r/>
+            <w:r>
+              <w:rPr>
+                <w:sz w:val="19"/>
+              </w:rPr>
+              <w:t>0041</w:t>
+            </w:r>
+          </w:p>
+        </w:tc>
+        <w:tc>
+          <w:tcPr>
+            <w:tcW w:type="dxa" w:w="1662"/>
+          </w:tcPr>
+          <w:p>
+            <w:r/>
+            <w:r>
+              <w:rPr>
+                <w:sz w:val="19"/>
+              </w:rPr>
+              <w:t>trading hours and shopping centre kept on a pending listing</w:t>
+            </w:r>
+          </w:p>
+        </w:tc>
+        <w:tc>
+          <w:tcPr>
+            <w:tcW w:type="dxa" w:w="1662"/>
+          </w:tcPr>
+          <w:p>
+            <w:r/>
+            <w:r>
+              <w:rPr>
+                <w:sz w:val="19"/>
+              </w:rPr>
+              <w:t>Applied on all three</w:t>
+            </w:r>
+          </w:p>
+        </w:tc>
+      </w:tr>
+      <w:tr>
+        <w:tc>
+          <w:tcPr>
+            <w:tcW w:type="dxa" w:w="1662"/>
+          </w:tcPr>
+          <w:p>
+            <w:r/>
+            <w:r>
+              <w:rPr>
+                <w:sz w:val="19"/>
+              </w:rPr>
+              <w:t>Rate limits</w:t>
+            </w:r>
+          </w:p>
+        </w:tc>
+        <w:tc>
+          <w:tcPr>
+            <w:tcW w:type="dxa" w:w="1662"/>
+          </w:tcPr>
+          <w:p>
+            <w:r/>
+            <w:r>
+              <w:rPr>
+                <w:sz w:val="19"/>
+              </w:rPr>
+              <w:t>0040</w:t>
+            </w:r>
+          </w:p>
+        </w:tc>
+        <w:tc>
+          <w:tcPr>
+            <w:tcW w:type="dxa" w:w="1662"/>
+          </w:tcPr>
+          <w:p>
+            <w:r/>
+            <w:r>
+              <w:rPr>
+                <w:sz w:val="19"/>
+              </w:rPr>
+              <w:t>0039</w:t>
+            </w:r>
+          </w:p>
+        </w:tc>
+        <w:tc>
+          <w:tcPr>
+            <w:tcW w:type="dxa" w:w="1662"/>
+          </w:tcPr>
+          <w:p>
+            <w:r/>
+            <w:r>
+              <w:rPr>
+                <w:sz w:val="19"/>
+              </w:rPr>
+              <w:t>0042</w:t>
+            </w:r>
+          </w:p>
+        </w:tc>
+        <w:tc>
+          <w:tcPr>
+            <w:tcW w:type="dxa" w:w="1662"/>
+          </w:tcPr>
+          <w:p>
+            <w:r/>
+            <w:r>
+              <w:rPr>
+                <w:sz w:val="19"/>
+              </w:rPr>
+              <w:t>per-visitor request counts for the public forms</w:t>
+            </w:r>
+          </w:p>
+        </w:tc>
+        <w:tc>
+          <w:tcPr>
+            <w:tcW w:type="dxa" w:w="1662"/>
+          </w:tcPr>
+          <w:p>
+            <w:r/>
+            <w:r>
+              <w:rPr>
+                <w:sz w:val="19"/>
+              </w:rPr>
+              <w:t>Applied on all three</w:t>
+            </w:r>
+          </w:p>
+        </w:tc>
+      </w:tr>
     </w:tbl>
     <w:p/>
     <w:p>
@@ -2749,15 +2962,7 @@
         <w:pStyle w:val="ListBullet"/>
       </w:pPr>
       <w:r>
-        <w:t>Trading hours and shopping centre from the listing form are only emailed to admin, not saved.</w:t>
-      </w:r>
-    </w:p>
-    <w:p>
-      <w:pPr>
-        <w:pStyle w:val="ListBullet"/>
-      </w:pPr>
-      <w:r>
-        <w:t>Suburb map has no data for Cape Town (no coordinates).</w:t>
+        <w:t>Suburb map: 6 Cape Town, 38 Pretoria and 7 Polokwane suburbs still have no coordinates and are not plotted.</w:t>
       </w:r>
     </w:p>
     <w:p>
@@ -2800,7 +3005,7 @@
         <w:pStyle w:val="ListBullet"/>
       </w:pPr>
       <w:r>
-        <w:t>Data issues found: four Cape Town businesses have no category (hidden from browsing); a few business websites are dead (</w:t>
+        <w:t>Data issues found: a few business websites are dead (</w:t>
       </w:r>
       <w:r>
         <w:rPr>
@@ -2849,26 +3054,18 @@
     </w:p>
     <w:p>
       <w:pPr>
-        <w:pStyle w:val="ListBullet"/>
+        <w:pStyle w:val="Heading1"/>
       </w:pPr>
       <w:r>
-        <w:rPr>
-          <w:rFonts w:ascii="Consolas" w:hAnsi="Consolas"/>
-          <w:color w:val="1F4E8C"/>
-          <w:sz w:val="19"/>
-        </w:rPr>
-        <w:t>/tourism/</w:t>
-      </w:r>
-      <w:r>
-        <w:t xml:space="preserve"> exists on Cape Town and Pretoria but nothing links to it.</w:t>
+        <w:t>21. Changes made outside the code (live data and services)</w:t>
       </w:r>
     </w:p>
     <w:p>
       <w:pPr>
-        <w:pStyle w:val="Heading1"/>
+        <w:pStyle w:val="ListBullet"/>
       </w:pPr>
       <w:r>
-        <w:t>21. Changes made outside the code (live data and services)</w:t>
+        <w:t>Live data added on 20 September: suburb map coordinates (Cape Town 162 of 168 suburbs, Pretoria +2, Polokwane +1, from OpenStreetMap), four missing categories added to Cape Town and four businesses categorised, news for Pretoria (2) and Polokwane (2), and every migration above applied to all three databases.</w:t>
       </w:r>
     </w:p>
     <w:p>

</xml_diff>

<commit_message>
Add the mockup's Things to do page for all cities and verify claims at the business's own email
Co-Authored-By: Claude Sonnet 5 <noreply@anthropic.com>
</commit_message>
<xml_diff>
--- a/CHANGES-ETHAN-BRANCH.docx
+++ b/CHANGES-ETHAN-BRANCH.docx
@@ -4707,6 +4707,155 @@
       </w:tr>
     </w:tbl>
     <w:p/>
+    <w:p>
+      <w:pPr>
+        <w:pStyle w:val="Heading1"/>
+      </w:pPr>
+      <w:r>
+        <w:t>Added 20 September (later)</w:t>
+      </w:r>
+    </w:p>
+    <w:p>
+      <w:pPr>
+        <w:pStyle w:val="ListBullet"/>
+      </w:pPr>
+      <w:r>
+        <w:rPr>
+          <w:b/>
+        </w:rPr>
+        <w:t>Things to do (tourism) page rebuilt from the mockup</w:t>
+      </w:r>
+      <w:r>
+        <w:t xml:space="preserve"> for all three cities (</w:t>
+      </w:r>
+      <w:r>
+        <w:rPr>
+          <w:rFonts w:ascii="Consolas" w:hAnsi="Consolas"/>
+          <w:color w:val="1F4E8C"/>
+          <w:sz w:val="19"/>
+        </w:rPr>
+        <w:t>src/site-content/tourism.ts</w:t>
+      </w:r>
+      <w:r>
+        <w:t xml:space="preserve">, </w:t>
+      </w:r>
+      <w:r>
+        <w:rPr>
+          <w:rFonts w:ascii="Consolas" w:hAnsi="Consolas"/>
+          <w:color w:val="1F4E8C"/>
+          <w:sz w:val="19"/>
+        </w:rPr>
+        <w:t>src/pages/tourism/index.astro</w:t>
+      </w:r>
+      <w:r>
+        <w:t>). "Things to do" now appears in the header, mobile menu and footer. Attraction cards link to Polokwane's full attraction pages where they exist and to a map search otherwise; the Sponsored badge shows only in the dev preview.</w:t>
+      </w:r>
+    </w:p>
+    <w:p>
+      <w:pPr>
+        <w:pStyle w:val="ListBullet"/>
+      </w:pPr>
+      <w:r>
+        <w:rPr>
+          <w:b/>
+        </w:rPr>
+        <w:t>Claims are verified at the business's own email address.</w:t>
+      </w:r>
+      <w:r>
+        <w:t xml:space="preserve"> </w:t>
+      </w:r>
+      <w:r>
+        <w:rPr>
+          <w:rFonts w:ascii="Consolas" w:hAnsi="Consolas"/>
+          <w:color w:val="1F4E8C"/>
+          <w:sz w:val="19"/>
+        </w:rPr>
+        <w:t>functions/api/claim-business.ts</w:t>
+      </w:r>
+      <w:r>
+        <w:t xml:space="preserve"> sends the link to the business email on file, tells the claimant to expect it there, and </w:t>
+      </w:r>
+      <w:r>
+        <w:rPr>
+          <w:rFonts w:ascii="Consolas" w:hAnsi="Consolas"/>
+          <w:color w:val="1F4E8C"/>
+          <w:sz w:val="19"/>
+        </w:rPr>
+        <w:t>functions/verify-claim.ts</w:t>
+      </w:r>
+      <w:r>
+        <w:t xml:space="preserve"> plus </w:t>
+      </w:r>
+      <w:r>
+        <w:rPr>
+          <w:rFonts w:ascii="Consolas" w:hAnsi="Consolas"/>
+          <w:color w:val="1F4E8C"/>
+          <w:sz w:val="19"/>
+        </w:rPr>
+        <w:t>functions/api/verify-claim.ts</w:t>
+      </w:r>
+      <w:r>
+        <w:t xml:space="preserve"> complete or decline the claim. New migration adds </w:t>
+      </w:r>
+      <w:r>
+        <w:rPr>
+          <w:rFonts w:ascii="Consolas" w:hAnsi="Consolas"/>
+          <w:color w:val="1F4E8C"/>
+          <w:sz w:val="19"/>
+        </w:rPr>
+        <w:t>verify_token</w:t>
+      </w:r>
+      <w:r>
+        <w:t xml:space="preserve">, </w:t>
+      </w:r>
+      <w:r>
+        <w:rPr>
+          <w:rFonts w:ascii="Consolas" w:hAnsi="Consolas"/>
+          <w:color w:val="1F4E8C"/>
+          <w:sz w:val="19"/>
+        </w:rPr>
+        <w:t>verify_sent_to</w:t>
+      </w:r>
+      <w:r>
+        <w:t xml:space="preserve"> and </w:t>
+      </w:r>
+      <w:r>
+        <w:rPr>
+          <w:rFonts w:ascii="Consolas" w:hAnsi="Consolas"/>
+          <w:color w:val="1F4E8C"/>
+          <w:sz w:val="19"/>
+        </w:rPr>
+        <w:t>email_verified_at</w:t>
+      </w:r>
+      <w:r>
+        <w:t xml:space="preserve"> to </w:t>
+      </w:r>
+      <w:r>
+        <w:rPr>
+          <w:rFonts w:ascii="Consolas" w:hAnsi="Consolas"/>
+          <w:color w:val="1F4E8C"/>
+          <w:sz w:val="19"/>
+        </w:rPr>
+        <w:t>business_claims</w:t>
+      </w:r>
+      <w:r>
+        <w:t xml:space="preserve"> (Cape Town 0041, Pretoria 0040, Polokwane 0043; applied to all three production databases). Businesses with no email on file still go to manual review.</w:t>
+      </w:r>
+    </w:p>
+    <w:p>
+      <w:pPr>
+        <w:pStyle w:val="ListBullet"/>
+      </w:pPr>
+      <w:r>
+        <w:rPr>
+          <w:b/>
+        </w:rPr>
+        <w:t>Four dead business websites cleared</w:t>
+      </w:r>
+      <w:r>
+        <w:t xml:space="preserve"> in Cape Town.</w:t>
+      </w:r>
+    </w:p>
     <w:sectPr>
       <w:pgSz w:w="12240" w:h="15840"/>
       <w:pgMar w:top="1134" w:right="1134" w:bottom="1134" w:left="1134" w:header="720" w:footer="720" w:gutter="0"/>

</xml_diff>

<commit_message>
Rebuild the suburb map as a free interactive MapLibre map with real municipal suburb outlines
Co-Authored-By: Claude Sonnet 5 <noreply@anthropic.com>
</commit_message>
<xml_diff>
--- a/CHANGES-ETHAN-BRANCH.docx
+++ b/CHANGES-ETHAN-BRANCH.docx
@@ -2657,6 +2657,86 @@
       </w:r>
       <w:r>
         <w:t>businesses` (Cape Town 0042, Pretoria 0041, Polokwane 0044).</w:t>
+      </w:r>
+    </w:p>
+    <w:p>
+      <w:pPr>
+        <w:pStyle w:val="ListBullet"/>
+      </w:pPr>
+      <w:r>
+        <w:rPr>
+          <w:b/>
+        </w:rPr>
+        <w:t>Interactive suburb map rebuilt</w:t>
+      </w:r>
+      <w:r>
+        <w:t xml:space="preserve"> (</w:t>
+      </w:r>
+      <w:r>
+        <w:rPr>
+          <w:rFonts w:ascii="Consolas" w:hAnsi="Consolas"/>
+          <w:color w:val="1F4E8C"/>
+          <w:sz w:val="19"/>
+        </w:rPr>
+        <w:t>src/pages/suburb/map.astro</w:t>
+      </w:r>
+      <w:r>
+        <w:t xml:space="preserve">, </w:t>
+      </w:r>
+      <w:r>
+        <w:rPr>
+          <w:rFonts w:ascii="Consolas" w:hAnsi="Consolas"/>
+          <w:color w:val="1F4E8C"/>
+          <w:sz w:val="19"/>
+        </w:rPr>
+        <w:t>src/lib/suburbBoundaries.ts</w:t>
+      </w:r>
+      <w:r>
+        <w:t xml:space="preserve">, </w:t>
+      </w:r>
+      <w:r>
+        <w:rPr>
+          <w:rFonts w:ascii="Consolas" w:hAnsi="Consolas"/>
+          <w:color w:val="1F4E8C"/>
+          <w:sz w:val="19"/>
+        </w:rPr>
+        <w:t>src/pages/suburb-boundaries.json.ts</w:t>
+      </w:r>
+      <w:r>
+        <w:t>). MapLibre GL with the free OpenFreeMap basemap; suburb outlines from municipal open data (</w:t>
+      </w:r>
+      <w:r>
+        <w:rPr>
+          <w:rFonts w:ascii="Consolas" w:hAnsi="Consolas"/>
+          <w:color w:val="1F4E8C"/>
+          <w:sz w:val="19"/>
+        </w:rPr>
+        <w:t>scripts/fetch-official-boundaries.mjs</w:t>
+      </w:r>
+      <w:r>
+        <w:t>) and OpenStreetMap (</w:t>
+      </w:r>
+      <w:r>
+        <w:rPr>
+          <w:rFonts w:ascii="Consolas" w:hAnsi="Consolas"/>
+          <w:color w:val="1F4E8C"/>
+          <w:sz w:val="19"/>
+        </w:rPr>
+        <w:t>scripts/fetch-suburb-boundaries.mjs</w:t>
+      </w:r>
+      <w:r>
+        <w:t xml:space="preserve">) saved in </w:t>
+      </w:r>
+      <w:r>
+        <w:rPr>
+          <w:rFonts w:ascii="Consolas" w:hAnsi="Consolas"/>
+          <w:color w:val="1F4E8C"/>
+          <w:sz w:val="19"/>
+        </w:rPr>
+        <w:t>src/site-content/&lt;city&gt;/suburb-boundaries.json</w:t>
+      </w:r>
+      <w:r>
+        <w:t>. Search, hover, click, near me, shade by region, count or category, detailed and tilted views, region filters and a suburb card.</w:t>
       </w:r>
     </w:p>
     <w:sectPr>

</xml_diff>

<commit_message>
Split fuel prices out of the daily news routine into a monthly first-Wednesday routine
Co-Authored-By: Claude Sonnet 5 <noreply@anthropic.com>
</commit_message>
<xml_diff>
--- a/CHANGES-ETHAN-BRANCH.docx
+++ b/CHANGES-ETHAN-BRANCH.docx
@@ -2622,6 +2622,53 @@
       </w:r>
       <w:r>
         <w:t xml:space="preserve"> in Cape Town.</w:t>
+      </w:r>
+    </w:p>
+    <w:p>
+      <w:pPr>
+        <w:pStyle w:val="ListBullet"/>
+      </w:pPr>
+      <w:r>
+        <w:rPr>
+          <w:b/>
+        </w:rPr>
+        <w:t>Fuel prices split from the news routine:</w:t>
+      </w:r>
+      <w:r>
+        <w:t xml:space="preserve"> new </w:t>
+      </w:r>
+      <w:r>
+        <w:rPr>
+          <w:rFonts w:ascii="Consolas" w:hAnsi="Consolas"/>
+          <w:color w:val="1F4E8C"/>
+          <w:sz w:val="19"/>
+        </w:rPr>
+        <w:t>ROUTINE.fuel.md</w:t>
+      </w:r>
+      <w:r>
+        <w:t xml:space="preserve"> (one monthly routine for all three cities) and </w:t>
+      </w:r>
+      <w:r>
+        <w:rPr>
+          <w:rFonts w:ascii="Consolas" w:hAnsi="Consolas"/>
+          <w:color w:val="1F4E8C"/>
+          <w:sz w:val="19"/>
+        </w:rPr>
+        <w:t>scripts/fuel-due.mjs</w:t>
+      </w:r>
+      <w:r>
+        <w:t xml:space="preserve"> (only due on the first Wednesday and the two days after). Fuel sections removed from the three </w:t>
+      </w:r>
+      <w:r>
+        <w:rPr>
+          <w:rFonts w:ascii="Consolas" w:hAnsi="Consolas"/>
+          <w:color w:val="1F4E8C"/>
+          <w:sz w:val="19"/>
+        </w:rPr>
+        <w:t>ROUTINE.news.&lt;city&gt;.md</w:t>
+      </w:r>
+      <w:r>
+        <w:t xml:space="preserve"> runbooks.</w:t>
       </w:r>
     </w:p>
     <w:p>

</xml_diff>

<commit_message>
Rewrite the routines as split, script-guarded runbooks on the dev branch (not scheduled, not on main)
Co-Authored-By: Claude Sonnet 5 <noreply@anthropic.com>
</commit_message>
<xml_diff>
--- a/CHANGES-ETHAN-BRANCH.docx
+++ b/CHANGES-ETHAN-BRANCH.docx
@@ -2643,7 +2643,7 @@
           <w:color w:val="1F4E8C"/>
           <w:sz w:val="19"/>
         </w:rPr>
-        <w:t>ROUTINE.fuel.md</w:t>
+        <w:t>routines/fuel.md</w:t>
       </w:r>
       <w:r>
         <w:t xml:space="preserve"> (one monthly routine for all three cities) and </w:t>
@@ -2784,6 +2784,119 @@
       </w:r>
       <w:r>
         <w:t>. Search, hover, click, near me, shade by region, count or category, detailed and tilted views, region filters and a suburb card.</w:t>
+      </w:r>
+    </w:p>
+    <w:p>
+      <w:pPr>
+        <w:pStyle w:val="ListBullet"/>
+      </w:pPr>
+      <w:r>
+        <w:rPr>
+          <w:b/>
+        </w:rPr>
+        <w:t>Routines rewritten on the dev branch (not scheduled, not on `main`):</w:t>
+      </w:r>
+      <w:r>
+        <w:t xml:space="preserve"> new </w:t>
+      </w:r>
+      <w:r>
+        <w:rPr>
+          <w:rFonts w:ascii="Consolas" w:hAnsi="Consolas"/>
+          <w:color w:val="1F4E8C"/>
+          <w:sz w:val="19"/>
+        </w:rPr>
+        <w:t>routines/</w:t>
+      </w:r>
+      <w:r>
+        <w:t xml:space="preserve"> folder with a shared rules file, four split business routines, events, news, fuel and tourism runbooks, and per-city settings; new </w:t>
+      </w:r>
+      <w:r>
+        <w:rPr>
+          <w:rFonts w:ascii="Consolas" w:hAnsi="Consolas"/>
+          <w:color w:val="1F4E8C"/>
+          <w:sz w:val="19"/>
+        </w:rPr>
+        <w:t>scripts/routines/</w:t>
+      </w:r>
+      <w:r>
+        <w:t xml:space="preserve"> (</w:t>
+      </w:r>
+      <w:r>
+        <w:rPr>
+          <w:rFonts w:ascii="Consolas" w:hAnsi="Consolas"/>
+          <w:color w:val="1F4E8C"/>
+          <w:sz w:val="19"/>
+        </w:rPr>
+        <w:t>next.mjs</w:t>
+      </w:r>
+      <w:r>
+        <w:t xml:space="preserve">, </w:t>
+      </w:r>
+      <w:r>
+        <w:rPr>
+          <w:rFonts w:ascii="Consolas" w:hAnsi="Consolas"/>
+          <w:color w:val="1F4E8C"/>
+          <w:sz w:val="19"/>
+        </w:rPr>
+        <w:t>validate.mjs</w:t>
+      </w:r>
+      <w:r>
+        <w:t xml:space="preserve">, </w:t>
+      </w:r>
+      <w:r>
+        <w:rPr>
+          <w:rFonts w:ascii="Consolas" w:hAnsi="Consolas"/>
+          <w:color w:val="1F4E8C"/>
+          <w:sz w:val="19"/>
+        </w:rPr>
+        <w:t>done.mjs</w:t>
+      </w:r>
+      <w:r>
+        <w:t xml:space="preserve">, </w:t>
+      </w:r>
+      <w:r>
+        <w:rPr>
+          <w:rFonts w:ascii="Consolas" w:hAnsi="Consolas"/>
+          <w:color w:val="1F4E8C"/>
+          <w:sz w:val="19"/>
+        </w:rPr>
+        <w:t>migrate-state.mjs</w:t>
+      </w:r>
+      <w:r>
+        <w:t xml:space="preserve">, </w:t>
+      </w:r>
+      <w:r>
+        <w:rPr>
+          <w:rFonts w:ascii="Consolas" w:hAnsi="Consolas"/>
+          <w:color w:val="1F4E8C"/>
+          <w:sz w:val="19"/>
+        </w:rPr>
+        <w:t>health.mjs</w:t>
+      </w:r>
+      <w:r>
+        <w:t xml:space="preserve">); per-routine state in </w:t>
+      </w:r>
+      <w:r>
+        <w:rPr>
+          <w:rFonts w:ascii="Consolas" w:hAnsi="Consolas"/>
+          <w:color w:val="1F4E8C"/>
+          <w:sz w:val="19"/>
+        </w:rPr>
+        <w:t>status/&lt;city&gt;/state/</w:t>
+      </w:r>
+      <w:r>
+        <w:t xml:space="preserve">; the snapshot writer also records each business's website and whether it has an email. The old </w:t>
+      </w:r>
+      <w:r>
+        <w:rPr>
+          <w:rFonts w:ascii="Consolas" w:hAnsi="Consolas"/>
+          <w:color w:val="1F4E8C"/>
+          <w:sz w:val="19"/>
+        </w:rPr>
+        <w:t>ROUTINE.&lt;city&gt;.md</w:t>
+      </w:r>
+      <w:r>
+        <w:t xml:space="preserve"> runbooks are untouched and remain the live ones.</w:t>
       </w:r>
     </w:p>
     <w:sectPr>

</xml_diff>

<commit_message>
Record the PayFast cancel bug fixes and the full live verification of the payment flow
Co-Authored-By: Claude Sonnet 5 <noreply@anthropic.com>
</commit_message>
<xml_diff>
--- a/CHANGES-ETHAN-BRANCH.docx
+++ b/CHANGES-ETHAN-BRANCH.docx
@@ -5350,6 +5350,70 @@
         <w:t xml:space="preserve"> block with PayFast's own publicly documented sandbox test credentials (merchant 10004002 — safe to commit, sandbox-only, moves no real money). Production keeps its own separate, encrypted PayFast secrets, never read from this file.</w:t>
       </w:r>
     </w:p>
+    <w:p>
+      <w:pPr>
+        <w:pStyle w:val="ListBullet"/>
+      </w:pPr>
+      <w:r>
+        <w:rPr>
+          <w:b/>
+        </w:rPr>
+        <w:t>Two more real PayFast bugs found and fixed in `functions/_lib/payfast.ts`, both in Cancel.</w:t>
+      </w:r>
+      <w:r>
+        <w:t xml:space="preserve"> The Subscriptions REST API signs requests differently from checkout (passphrase sorted in alphabetically, not appended last) — getting it wrong silently looked like a credentials problem ("Merchant authorization failed"). Also, </w:t>
+      </w:r>
+      <w:r>
+        <w:rPr>
+          <w:rFonts w:ascii="Consolas" w:hAnsi="Consolas"/>
+          <w:color w:val="1F4E8C"/>
+          <w:sz w:val="19"/>
+        </w:rPr>
+        <w:t>cancelPayfastSubscription</w:t>
+      </w:r>
+      <w:r>
+        <w:t xml:space="preserve"> now checks the response body, not just the HTTP status: PayFast can return HTTP 200 with a body saying the action failed, which would otherwise have told an owner their subscription was cancelled while PayFast kept charging them.</w:t>
+      </w:r>
+    </w:p>
+    <w:p>
+      <w:pPr>
+        <w:pStyle w:val="ListBullet"/>
+      </w:pPr>
+      <w:r>
+        <w:rPr>
+          <w:b/>
+        </w:rPr>
+        <w:t>Verified live against the real database and the real PayFast sandbox:</w:t>
+      </w:r>
+      <w:r>
+        <w:t xml:space="preserve"> tier checkout, sponsorship checkout, the sponsorship exclusivity guard, the subscription expiry sweep (downgrade, slot freed, re-purchasable), Cancel's failure path, and the rejected-paid-listing refund note.</w:t>
+      </w:r>
+    </w:p>
+    <w:p>
+      <w:pPr>
+        <w:pStyle w:val="ListBullet"/>
+      </w:pPr>
+      <w:r>
+        <w:rPr>
+          <w:b/>
+        </w:rPr>
+        <w:t>Preview environment gained a fresh `CRON_SECRET`</w:t>
+      </w:r>
+      <w:r>
+        <w:t xml:space="preserve"> (an internally-invented value, not a third-party secret) via the same </w:t>
+      </w:r>
+      <w:r>
+        <w:rPr>
+          <w:rFonts w:ascii="Consolas" w:hAnsi="Consolas"/>
+          <w:color w:val="1F4E8C"/>
+          <w:sz w:val="19"/>
+        </w:rPr>
+        <w:t>env.preview</w:t>
+      </w:r>
+      <w:r>
+        <w:t xml:space="preserve"> mechanism, so the admin sweep endpoints are testable on the dev preview.</w:t>
+      </w:r>
+    </w:p>
     <w:sectPr>
       <w:pgSz w:w="12240" w:h="15840"/>
       <w:pgMar w:top="1134" w:right="1134" w:bottom="1134" w:left="1134" w:header="720" w:footer="720" w:gutter="0"/>

</xml_diff>

<commit_message>
Generate free, non-copyrighted AI images for events with none, via Cloudflare Workers AI
Co-Authored-By: Claude Sonnet 5 <noreply@anthropic.com>
</commit_message>
<xml_diff>
--- a/CHANGES-ETHAN-BRANCH.docx
+++ b/CHANGES-ETHAN-BRANCH.docx
@@ -5414,6 +5414,53 @@
         <w:t xml:space="preserve"> mechanism, so the admin sweep endpoints are testable on the dev preview.</w:t>
       </w:r>
     </w:p>
+    <w:p>
+      <w:pPr>
+        <w:pStyle w:val="ListBullet"/>
+      </w:pPr>
+      <w:r>
+        <w:rPr>
+          <w:b/>
+        </w:rPr>
+        <w:t>Events now get a free, non-copyrighted, AI-generated image when no real photo was found.</w:t>
+      </w:r>
+      <w:r>
+        <w:t xml:space="preserve"> New </w:t>
+      </w:r>
+      <w:r>
+        <w:rPr>
+          <w:rFonts w:ascii="Consolas" w:hAnsi="Consolas"/>
+          <w:color w:val="1F4E8C"/>
+          <w:sz w:val="19"/>
+        </w:rPr>
+        <w:t>scripts/generate-event-images.mjs</w:t>
+      </w:r>
+      <w:r>
+        <w:t xml:space="preserve"> uses Cloudflare Workers AI (</w:t>
+      </w:r>
+      <w:r>
+        <w:rPr>
+          <w:rFonts w:ascii="Consolas" w:hAnsi="Consolas"/>
+          <w:color w:val="1F4E8C"/>
+          <w:sz w:val="19"/>
+        </w:rPr>
+        <w:t>@cf/black-forest-labs/flux-1-schnell</w:t>
+      </w:r>
+      <w:r>
+        <w:t xml:space="preserve">, no external API key) to generate a themed flat-illustration image matching the event's type, stores it in R2, and links it — never overwriting a real photo. </w:t>
+      </w:r>
+      <w:r>
+        <w:rPr>
+          <w:rFonts w:ascii="Consolas" w:hAnsi="Consolas"/>
+          <w:color w:val="1F4E8C"/>
+          <w:sz w:val="19"/>
+        </w:rPr>
+        <w:t>routines/events.md</w:t>
+      </w:r>
+      <w:r>
+        <w:t xml:space="preserve"> updated to call it as the fallback step after the agent's own image search comes up empty. Run live for all 20 imageless PretoriaHub events on 21 September.</w:t>
+      </w:r>
+    </w:p>
     <w:sectPr>
       <w:pgSz w:w="12240" w:h="15840"/>
       <w:pgMar w:top="1134" w:right="1134" w:bottom="1134" w:left="1134" w:header="720" w:footer="720" w:gutter="0"/>

</xml_diff>